<commit_message>
Fix remaining CICES references and improve PDF landscape scaling
CICES fixes:
- Replaced "CICES category" with "SEEA EA reference list" in
  generate_examples.py, generate_blank_tables.py, generate_filled_examples.py
- Regenerated all affected Word docs and Excel files
- No more CICES references anywhere in the event materials

PDF improvements:
- Regenerated all 16 HTML-to-PDF conversions with landscape scaling
  (CSS @page { size: landscape }) to prevent content being cut off
- Updated all print notebook copies

Co-Authored-By: Claude Opus 4.6 (1M context) <noreply@anthropic.com>
</commit_message>
<xml_diff>
--- a/s-s-event-bogor/print-notebooks/03-services/10-blank-tables.docx
+++ b/s-s-event-bogor/print-notebooks/03-services/10-blank-tables.docx
@@ -112,9 +112,9 @@
                 <w:color w:val="FFFFFF"/>
                 <w:sz w:val="20"/>
               </w:rPr>
-              <w:t>CICES</w:t>
+              <w:t>SEEA EA</w:t>
               <w:br/>
-              <w:t>category</w:t>
+              <w:t>reference list</w:t>
             </w:r>
           </w:p>
         </w:tc>

</xml_diff>